<commit_message>
Trim resume: shorter summary, 2 AirSprint bullets, Calgary Housing 2 bullets, remove AI Judge
Co-Authored-By: Claude Sonnet 4.6 <noreply@anthropic.com>
</commit_message>
<xml_diff>
--- a/Resume.docx
+++ b/Resume.docx
@@ -242,10 +242,7 @@
         <w:pStyle w:val="22"/>
       </w:pPr>
       <w:r>
-        <w:rPr>
-          <w:rFonts w:hint="default"/>
-        </w:rPr>
-        <w:t>Data Scientist who builds end-to-end automated intelligence systems — from raw data scraping through ML modeling to multi-agent AI simulation. Production experience deploying forecasting models at AirSprint (6% live MAPE, $490K+ cost reduction). Recent independent work: a fully automated Calgary Housing pipeline covering 21 years of data, three XGBoost models, live news ingestion, auto-generated market reports, and a MiroFish geopolitical simulation that predicts housing outcomes through emergent AI agent behavior. TN visa eligible, targeting US Data Science and ML Engineering roles.</w:t>
+        <w:t>Data Scientist with production ML experience and a track record of shipping end-to-end data systems. Built forecasting models at AirSprint (6% live MAPE, $490K+ cost reduction) and an automated Calgary Housing intelligence pipeline spanning data scraping, XGBoost modeling, live news ingestion, and multi-agent geopolitical simulation. TN visa eligible, targeting US Data Science and ML Engineering roles.</w:t>
       </w:r>
     </w:p>
     <w:p>
@@ -331,11 +328,7 @@
         <w:pStyle w:val="23"/>
       </w:pPr>
       <w:r>
-        <w:rPr>
-          <w:rFonts w:hint="eastAsia" w:eastAsia="SimSun"/>
-          <w:lang w:val="en-US" w:eastAsia="zh-CN"/>
-        </w:rPr>
-        <w:t>Conducted EDA on 12 years of flight operations data across 78K+ flights to identify key demand drivers, seasonality factors, and a COVID-era regime shift informing model design</w:t>
+        <w:t>Built and deployed a Prophet forecasting model on 12 years of flight data (78K+ flights), achieving 6% weekly MAPE in live 2026 production and targeting $490K+ reduction in annual empty leg positioning costs</w:t>
       </w:r>
     </w:p>
     <w:p>
@@ -343,11 +336,33 @@
         <w:pStyle w:val="23"/>
       </w:pPr>
       <w:r>
-        <w:rPr>
-          <w:rFonts w:hint="eastAsia" w:eastAsia="SimSun"/>
-          <w:lang w:val="en-US" w:eastAsia="zh-CN"/>
-        </w:rPr>
-        <w:t>Built and deployed a Prophet time-series forecasting model achieving 10% weekly / 7% monthly MAPE in backtesting and 6% weekly / 2% monthly MAPE in live 2026 production, targeting 1%+ reduction in $49M annual empty leg positioning costs</w:t>
+        <w:t>Architected automated ingestion pipelines (FL3XX, Salesforce, Foreflight → Lambda → S3 → Snowflake) and QuickSight dashboards for executive stakeholders</w:t>
+      </w:r>
+    </w:p>
+    <w:p>
+      <w:pPr>
+        <w:pStyle w:val="21"/>
+      </w:pPr>
+      <w:r>
+        <w:t>PROJECTS</w:t>
+      </w:r>
+    </w:p>
+    <w:p>
+      <w:pPr>
+        <w:pStyle w:val="24"/>
+      </w:pPr>
+      <w:r>
+        <w:t>Calgary Housing Price Predictor</w:t>
+        <w:tab/>
+        <w:t>Mar 2026</w:t>
+      </w:r>
+    </w:p>
+    <w:p>
+      <w:pPr>
+        <w:pStyle w:val="26"/>
+      </w:pPr>
+      <w:r>
+        <w:t>github.com/dingjamma/Calgary-Housing · Live Dashboard: calgary-housing-7phh7dhjyyd2r7mtjymuvm.streamlit.app</w:t>
       </w:r>
     </w:p>
     <w:p>
@@ -355,18 +370,7 @@
         <w:pStyle w:val="23"/>
       </w:pPr>
       <w:r>
-        <w:rPr>
-          <w:rFonts w:hint="default"/>
-        </w:rPr>
-        <w:t>Built automated data ingestion pipelines (FL3XX, Salesforc</w:t>
-      </w:r>
-      <w:bookmarkStart w:id="0" w:name="_GoBack"/>
-      <w:bookmarkEnd w:id="0"/>
-      <w:r>
-        <w:rPr>
-          <w:rFonts w:hint="default"/>
-        </w:rPr>
-        <w:t>e, Foreflight → AWS Lambda → S3 → Snowflake) with end-to-end data quality monitoring and alerting</w:t>
+        <w:t>Fully automated pipeline scraping 21 years of housing, oil, and economic data; trained three XGBoost models (annual, monthly, daily) with a live Housing Pressure Score deployed on Streamlit</w:t>
       </w:r>
     </w:p>
     <w:p>
@@ -374,131 +378,7 @@
         <w:pStyle w:val="23"/>
       </w:pPr>
       <w:r>
-        <w:rPr>
-          <w:rFonts w:hint="default"/>
-        </w:rPr>
-        <w:t>Designed a data-driven RBAC workaround for FL3XX's booking platform by building a cleansing and segmentation pipeline with custom business logic mapping user roles (owner, individual, full access) and a manual override layer to manage edge cases</w:t>
-      </w:r>
-    </w:p>
-    <w:p>
-      <w:pPr>
-        <w:pStyle w:val="23"/>
-      </w:pPr>
-      <w:r>
-        <w:rPr>
-          <w:rFonts w:hint="default"/>
-        </w:rPr>
-        <w:t>Built QuickSight dashboards enabling real-time monitoring of operational KPIs, flight demand trends, and fleet utilization for executive and operational stakeholders</w:t>
-      </w:r>
-    </w:p>
-    <w:p>
-      <w:pPr>
-        <w:pStyle w:val="21"/>
-      </w:pPr>
-      <w:r>
-        <w:t>PROJECTS</w:t>
-      </w:r>
-    </w:p>
-    <w:p>
-      <w:pPr>
-        <w:pStyle w:val="24"/>
-      </w:pPr>
-      <w:r>
-        <w:t>Calgary Housing Price Predictor — Full Intelligence Pipeline</w:t>
-      </w:r>
-      <w:r>
-        <w:tab/>
-      </w:r>
-      <w:r>
-        <w:t>Mar 2026</w:t>
-      </w:r>
-    </w:p>
-    <w:p>
-      <w:pPr>
-        <w:pStyle w:val="26"/>
-      </w:pPr>
-      <w:r>
-        <w:t>github.com/dingjamma/Calgary-Housing · Live Dashboard: calgary-housing-7phh7dhjyyd2r7mtjymuvm.streamlit.app</w:t>
-      </w:r>
-    </w:p>
-    <w:p>
-      <w:pPr>
-        <w:pStyle w:val="23"/>
-      </w:pPr>
-      <w:r>
-        <w:t>Built a fully automated data pipeline with no manual downloads — scrapes 21 years of housing, oil, and economic data from City of Calgary Socrata API, CREB monthly PDFs (pdfplumber + Wayback Machine), Bank of Canada Valet API, and yfinance at daily resolution</w:t>
-      </w:r>
-    </w:p>
-    <w:p>
-      <w:pPr>
-        <w:pStyle w:val="23"/>
-      </w:pPr>
-      <w:r>
-        <w:t>Trained three XGBoost models at annual (19 years), monthly (44 CREB months), and daily (946 days) resolution; daily Housing Pressure Score reads +1.66% at current $100/barrel WTI, signaling short-term uncertainty despite long-term bullish fundamentals</w:t>
-      </w:r>
-    </w:p>
-    <w:p>
-      <w:pPr>
-        <w:pStyle w:val="23"/>
-      </w:pPr>
-      <w:r>
-        <w:t>Built an intelligence layer that scrapes live news via RSS (CBC Calgary, OilPrice.com, Better Dwelling), auto-generates a structured market report, then feeds it into MiroFish — a multi-agent geopolitical simulation running 8 AI actors (Bank of Canada, OPEC+, Iran/IRGC, Alberta energy sector, Calgary buyer segments) on a Zep GraphRAG knowledge graph via qwen-plus</w:t>
-      </w:r>
-    </w:p>
-    <w:p>
-      <w:pPr>
-        <w:pStyle w:val="23"/>
-      </w:pPr>
-      <w:r>
-        <w:t>Deployed live Streamlit dashboard; automated full pipeline via GitHub Actions (biweekly) — scrape, retrain, news, report, simulate, translate Chinese output to English, commit all results back to GitHub automatically</w:t>
-      </w:r>
-    </w:p>
-    <w:p>
-      <w:pPr>
-        <w:pStyle w:val="24"/>
-        <w:tabs>
-          <w:tab w:val="right" w:pos="10710"/>
-        </w:tabs>
-      </w:pPr>
-      <w:r>
-        <w:rPr>
-          <w:rFonts w:hint="default"/>
-        </w:rPr>
-        <w:t>AI Judge — SCOTUS Verdict Backtester</w:t>
-      </w:r>
-      <w:r>
-        <w:tab/>
-      </w:r>
-      <w:r>
-        <w:rPr>
-          <w:rFonts w:hint="default"/>
-        </w:rPr>
-        <w:t>Mar 2026</w:t>
-      </w:r>
-    </w:p>
-    <w:p>
-      <w:pPr>
-        <w:pStyle w:val="26"/>
-        <w:tabs>
-          <w:tab w:val="right" w:pos="10710"/>
-        </w:tabs>
-      </w:pPr>
-      <w:r>
-        <w:rPr>
-          <w:rFonts w:hint="default"/>
-        </w:rPr>
-        <w:t>github.com/dingjamma/ai_judge</w:t>
-      </w:r>
-    </w:p>
-    <w:p>
-      <w:pPr>
-        <w:pStyle w:val="23"/>
-      </w:pPr>
-      <w:r>
-        <w:rPr>
-          <w:rFonts w:hint="default"/>
-        </w:rPr>
-        <w:t>Built a RAG backtesting pipeline over 200 landmark SCOTUS cases with temporal leakage prevention — Claude 3.5 Haiku on AWS Bedrock, FAISS vector search, MLflow experiment tracking, and a Streamlit dashboard; achieved 45.7% backtested accuracy on held-out cases</w:t>
+        <w:t>Built an intelligence layer — live news scraper, auto-generated market reports, and a MiroFish multi-agent simulation (8 AI actors: BoC, OPEC+, Iran/IRGC, Alberta energy, Calgary buyers) predicting December 2026 housing outcomes; automated biweekly via GitHub Actions</w:t>
       </w:r>
     </w:p>
     <w:p>

</xml_diff>

<commit_message>
Fix Resume.docx: restore AirSprint bullets, vague summary, fix Calgary Housing format
Co-Authored-By: Claude Sonnet 4.6 <noreply@anthropic.com>
</commit_message>
<xml_diff>
--- a/Resume.docx
+++ b/Resume.docx
@@ -242,7 +242,7 @@
         <w:pStyle w:val="22"/>
       </w:pPr>
       <w:r>
-        <w:t>Data Scientist with production ML experience and a track record of shipping end-to-end data systems. Built forecasting models at AirSprint (6% live MAPE, $490K+ cost reduction) and an automated Calgary Housing intelligence pipeline spanning data scraping, XGBoost modeling, live news ingestion, and multi-agent geopolitical simulation. TN visa eligible, targeting US Data Science and ML Engineering roles.</w:t>
+        <w:t>Data Scientist with experience building end-to-end ML systems and automated data pipelines. Background in private aviation, logistics, and agriculture. TN visa eligible, targeting US Data Science and ML Engineering roles.</w:t>
       </w:r>
     </w:p>
     <w:p>
@@ -328,7 +328,7 @@
         <w:pStyle w:val="23"/>
       </w:pPr>
       <w:r>
-        <w:t>Built and deployed a Prophet forecasting model on 12 years of flight data (78K+ flights), achieving 6% weekly MAPE in live 2026 production and targeting $490K+ reduction in annual empty leg positioning costs</w:t>
+        <w:t>Conducted EDA on 12 years of flight operations data across 78K+ flights to identify key demand drivers, seasonality factors, and a COVID-era regime shift informing model design</w:t>
       </w:r>
     </w:p>
     <w:p>
@@ -336,7 +336,31 @@
         <w:pStyle w:val="23"/>
       </w:pPr>
       <w:r>
-        <w:t>Architected automated ingestion pipelines (FL3XX, Salesforce, Foreflight → Lambda → S3 → Snowflake) and QuickSight dashboards for executive stakeholders</w:t>
+        <w:t>Built and deployed a Prophet time-series forecasting model achieving 10% weekly / 7% monthly MAPE in backtesting and 6% weekly / 2% monthly MAPE in live 2026 production, targeting 1%+ reduction in $49M annual empty leg positioning costs</w:t>
+      </w:r>
+    </w:p>
+    <w:p>
+      <w:pPr>
+        <w:pStyle w:val="23"/>
+      </w:pPr>
+      <w:r>
+        <w:t xml:space="preserve">Built automated data ingestion pipelines (FL3XX, Salesforce, Foreflight → AWS Lambda → S3 → Snowflake) with end-to-end data quality monitoring and alerting</w:t>
+      </w:r>
+    </w:p>
+    <w:p>
+      <w:pPr>
+        <w:pStyle w:val="23"/>
+      </w:pPr>
+      <w:r>
+        <w:t xml:space="preserve">Designed a data-driven RBAC workaround for FL3XX’s booking platform by building a cleansing and segmentation pipeline with custom business logic mapping user roles (owner, individual, full access) and a manual override layer to manage edge cases</w:t>
+      </w:r>
+    </w:p>
+    <w:p>
+      <w:pPr>
+        <w:pStyle w:val="23"/>
+      </w:pPr>
+      <w:r>
+        <w:t xml:space="preserve">Built QuickSight dashboards enabling real-time monitoring of operational KPIs, flight demand trends, and fleet utilization for executive and operational stakeholders</w:t>
       </w:r>
     </w:p>
     <w:p>

</xml_diff>

<commit_message>
Update resume — skills overhaul, Calgary Housing expanded to 3 bullets, restore all AirSprint bullets
Co-Authored-By: Claude Sonnet 4.6 <noreply@anthropic.com>
</commit_message>
<xml_diff>
--- a/Resume.docx
+++ b/Resume.docx
@@ -194,18 +194,35 @@
       <w:r>
         <w:t xml:space="preserve">| </w:t>
       </w:r>
-      <w:hyperlink r:id="rId10">
-        <w:r>
-          <w:rPr>
-            <w:rStyle w:val="10"/>
-            <w:rFonts w:hint="eastAsia" w:eastAsia="SimSun"/>
-            <w:sz w:val="28"/>
-            <w:szCs w:val="28"/>
-            <w:lang w:val="en-US" w:eastAsia="zh-CN"/>
-          </w:rPr>
-          <w:t>Portfolio</w:t>
-        </w:r>
-      </w:hyperlink>
+      <w:r>
+        <w:fldChar w:fldCharType="begin"/>
+      </w:r>
+      <w:r>
+        <w:instrText xml:space="preserve"> HYPERLINK "https://dingjames.com" \h </w:instrText>
+      </w:r>
+      <w:r>
+        <w:fldChar w:fldCharType="separate"/>
+      </w:r>
+      <w:r>
+        <w:rPr>
+          <w:rStyle w:val="10"/>
+          <w:rFonts w:hint="eastAsia" w:eastAsia="SimSun"/>
+          <w:sz w:val="28"/>
+          <w:szCs w:val="28"/>
+          <w:lang w:val="en-US" w:eastAsia="zh-CN"/>
+        </w:rPr>
+        <w:t>Portfolio</w:t>
+      </w:r>
+      <w:r>
+        <w:rPr>
+          <w:rStyle w:val="10"/>
+          <w:rFonts w:hint="eastAsia" w:eastAsia="SimSun"/>
+          <w:sz w:val="28"/>
+          <w:szCs w:val="28"/>
+          <w:lang w:val="en-US" w:eastAsia="zh-CN"/>
+        </w:rPr>
+        <w:fldChar w:fldCharType="end"/>
+      </w:r>
     </w:p>
     <w:p>
       <w:pPr>
@@ -227,22 +244,6 @@
           <w:lang w:val="en-US" w:eastAsia="zh-CN"/>
         </w:rPr>
         <w:t>Calgary, AB · TN Visa Eligible</w:t>
-      </w:r>
-    </w:p>
-    <w:p>
-      <w:pPr>
-        <w:pStyle w:val="21"/>
-      </w:pPr>
-      <w:r>
-        <w:t>PROFESSIONAL SUMMARY</w:t>
-      </w:r>
-    </w:p>
-    <w:p>
-      <w:pPr>
-        <w:pStyle w:val="22"/>
-      </w:pPr>
-      <w:r>
-        <w:t>Data Scientist with experience building end-to-end ML systems and automated data pipelines. Background in private aviation, logistics, and agriculture. TN visa eligible, targeting US Data Science and ML Engineering roles.</w:t>
       </w:r>
     </w:p>
     <w:p>
@@ -344,7 +345,7 @@
         <w:pStyle w:val="23"/>
       </w:pPr>
       <w:r>
-        <w:t xml:space="preserve">Built automated data ingestion pipelines (FL3XX, Salesforce, Foreflight → AWS Lambda → S3 → Snowflake) with end-to-end data quality monitoring and alerting</w:t>
+        <w:t>Built automated data ingestion pipelines (FL3XX, Salesforce, Foreflight → AWS Lambda → S3 → Snowflake) with end-to-end data quality monitoring and alerting</w:t>
       </w:r>
     </w:p>
     <w:p>
@@ -352,7 +353,7 @@
         <w:pStyle w:val="23"/>
       </w:pPr>
       <w:r>
-        <w:t xml:space="preserve">Designed a data-driven RBAC workaround for FL3XX’s booking platform by building a cleansing and segmentation pipeline with custom business logic mapping user roles (owner, individual, full access) and a manual override layer to manage edge cases</w:t>
+        <w:t>Designed a data-driven RBAC workaround for FL3XX’s booking platform by building a cleansing and segmentation pipeline with custom business logic mapping user roles (owner, individual, full access) and a manual override layer to manage edge cases</w:t>
       </w:r>
     </w:p>
     <w:p>
@@ -374,19 +375,93 @@
     <w:p>
       <w:pPr>
         <w:pStyle w:val="24"/>
+        <w:rPr>
+          <w:rFonts w:hint="default" w:eastAsia="SimSun"/>
+          <w:lang w:val="en-US" w:eastAsia="zh-CN"/>
+        </w:rPr>
       </w:pPr>
       <w:r>
         <w:t>Calgary Housing Price Predictor</w:t>
+      </w:r>
+      <w:r>
         <w:tab/>
+      </w:r>
+      <w:r>
+        <w:rPr>
+          <w:rFonts w:hint="eastAsia" w:eastAsia="SimSun"/>
+          <w:lang w:val="en-US" w:eastAsia="zh-CN"/>
+        </w:rPr>
+        <w:t xml:space="preserve">                                                                                                                     </w:t>
+      </w:r>
+      <w:r>
         <w:t>Mar 2026</w:t>
       </w:r>
     </w:p>
     <w:p>
       <w:pPr>
-        <w:pStyle w:val="26"/>
-      </w:pPr>
-      <w:r>
-        <w:t>github.com/dingjamma/Calgary-Housing · Live Dashboard: calgary-housing-7phh7dhjyyd2r7mtjymuvm.streamlit.app</w:t>
+        <w:pStyle w:val="24"/>
+      </w:pPr>
+      <w:r>
+        <w:rPr>
+          <w:rFonts w:hint="eastAsia" w:eastAsia="SimSun"/>
+          <w:b w:val="0"/>
+          <w:bCs w:val="0"/>
+          <w:lang w:val="en-US" w:eastAsia="zh-CN"/>
+        </w:rPr>
+        <w:fldChar w:fldCharType="begin"/>
+      </w:r>
+      <w:r>
+        <w:rPr>
+          <w:rFonts w:hint="eastAsia" w:eastAsia="SimSun"/>
+          <w:b w:val="0"/>
+          <w:bCs w:val="0"/>
+          <w:lang w:val="en-US" w:eastAsia="zh-CN"/>
+        </w:rPr>
+        <w:instrText xml:space="preserve"> HYPERLINK "https://github.com/dingjamma/Calgary-Housing" </w:instrText>
+      </w:r>
+      <w:r>
+        <w:rPr>
+          <w:rFonts w:hint="eastAsia" w:eastAsia="SimSun"/>
+          <w:b w:val="0"/>
+          <w:bCs w:val="0"/>
+          <w:lang w:val="en-US" w:eastAsia="zh-CN"/>
+        </w:rPr>
+        <w:fldChar w:fldCharType="separate"/>
+      </w:r>
+      <w:r>
+        <w:rPr>
+          <w:rStyle w:val="11"/>
+          <w:rFonts w:hint="eastAsia" w:eastAsia="SimSun"/>
+          <w:b w:val="0"/>
+          <w:bCs w:val="0"/>
+          <w:lang w:val="en-US" w:eastAsia="zh-CN"/>
+        </w:rPr>
+        <w:t>https://github.com/dingjamma/Calgary-Housing</w:t>
+      </w:r>
+      <w:r>
+        <w:rPr>
+          <w:rFonts w:hint="eastAsia" w:eastAsia="SimSun"/>
+          <w:b w:val="0"/>
+          <w:bCs w:val="0"/>
+          <w:lang w:val="en-US" w:eastAsia="zh-CN"/>
+        </w:rPr>
+        <w:fldChar w:fldCharType="end"/>
+      </w:r>
+      <w:r>
+        <w:rPr>
+          <w:rFonts w:hint="eastAsia" w:eastAsia="SimSun"/>
+          <w:b w:val="0"/>
+          <w:bCs w:val="0"/>
+          <w:lang w:val="en-US" w:eastAsia="zh-CN"/>
+        </w:rPr>
+        <w:t xml:space="preserve">    </w:t>
+      </w:r>
+      <w:r>
+        <w:rPr>
+          <w:rFonts w:hint="eastAsia" w:eastAsia="SimSun"/>
+          <w:lang w:val="en-US" w:eastAsia="zh-CN"/>
+        </w:rPr>
+        <w:t xml:space="preserve">                                                                                                            </w:t>
       </w:r>
     </w:p>
     <w:p>
@@ -402,7 +477,15 @@
         <w:pStyle w:val="23"/>
       </w:pPr>
       <w:r>
-        <w:t>Built an intelligence layer — live news scraper, auto-generated market reports, and a MiroFish multi-agent simulation (8 AI actors: BoC, OPEC+, Iran/IRGC, Alberta energy, Calgary buyers) predicting December 2026 housing outcomes; automated biweekly via GitHub Actions</w:t>
+        <w:t>Built an intelligence layer — live news scraper (CBC, OilPrice, Better Dwelling) and auto-generated market reports, automated biweekly via GitHub Actions</w:t>
+      </w:r>
+    </w:p>
+    <w:p>
+      <w:pPr>
+        <w:pStyle w:val="23"/>
+      </w:pPr>
+      <w:r>
+        <w:t>Integrated MiroFish multi-agent geopolitical simulation (8 AI actors: BoC, OPEC+, Iran/IRGC, Alberta energy, Calgary buyers) using OASIS, CAMEL-AI, and GraphRAG (Zep) to predict December 2026 housing outcomes</w:t>
       </w:r>
     </w:p>
     <w:p>
@@ -412,6 +495,8 @@
       <w:r>
         <w:t>EDUCATION</w:t>
       </w:r>
+      <w:bookmarkStart w:id="0" w:name="_GoBack"/>
+      <w:bookmarkEnd w:id="0"/>
     </w:p>
     <w:p>
       <w:pPr>
@@ -541,10 +626,55 @@
       <w:pPr>
         <w:pStyle w:val="29"/>
         <w:rPr>
+          <w:rFonts w:hint="default" w:eastAsia="SimSun"/>
+          <w:b w:val="0"/>
+          <w:bCs w:val="0"/>
+          <w:lang w:val="en-US" w:eastAsia="zh-CN"/>
+        </w:rPr>
+      </w:pPr>
+      <w:r>
+        <w:rPr>
+          <w:rFonts w:hint="eastAsia" w:eastAsia="SimSun"/>
+          <w:b/>
+          <w:bCs/>
+          <w:lang w:val="en-US" w:eastAsia="zh-CN"/>
+        </w:rPr>
+        <w:t>Languages</w:t>
+      </w:r>
+      <w:r>
+        <w:rPr>
           <w:rFonts w:hint="default"/>
           <w:b/>
           <w:bCs/>
         </w:rPr>
+        <w:t>:</w:t>
+      </w:r>
+      <w:r>
+        <w:rPr>
+          <w:rFonts w:hint="default"/>
+          <w:b w:val="0"/>
+          <w:bCs w:val="0"/>
+        </w:rPr>
+        <w:t xml:space="preserve"> Python, SQL, R, JavaScript</w:t>
+      </w:r>
+      <w:r>
+        <w:rPr>
+          <w:rFonts w:hint="eastAsia" w:eastAsia="SimSun"/>
+          <w:b w:val="0"/>
+          <w:bCs w:val="0"/>
+          <w:lang w:val="en-US" w:eastAsia="zh-CN"/>
+        </w:rPr>
+      </w:r>
+    </w:p>
+    <w:p>
+      <w:pPr>
+        <w:pStyle w:val="29"/>
+        <w:rPr>
+          <w:rFonts w:hint="default" w:eastAsia="SimSun"/>
+          <w:b w:val="0"/>
+          <w:bCs w:val="0"/>
+          <w:lang w:val="en-US" w:eastAsia="zh-CN"/>
+        </w:rPr>
       </w:pPr>
       <w:r>
         <w:rPr>
@@ -552,180 +682,132 @@
           <w:b/>
           <w:bCs/>
         </w:rPr>
-        <w:t xml:space="preserve">Programming: </w:t>
-      </w:r>
-      <w:r>
-        <w:rPr>
-          <w:rFonts w:hint="default"/>
+        <w:t xml:space="preserve">Machine Learning: </w:t>
+      </w:r>
+      <w:r>
+        <w:rPr>
+          <w:rFonts w:hint="eastAsia" w:eastAsia="SimSun"/>
           <w:b w:val="0"/>
           <w:bCs w:val="0"/>
-        </w:rPr>
-        <w:t>Python, SQL, R, JavaScript</w:t>
+          <w:lang w:val="en-US" w:eastAsia="zh-CN"/>
+        </w:rPr>
+        <w:t>XGBoost, Random Forest, scikit-learn, time-series forecasting, classification, feature engineering</w:t>
       </w:r>
     </w:p>
     <w:p>
       <w:pPr>
         <w:pStyle w:val="29"/>
         <w:rPr>
-          <w:rFonts w:hint="default"/>
+          <w:rFonts w:hint="default" w:eastAsia="SimSun"/>
           <w:b w:val="0"/>
           <w:bCs w:val="0"/>
-        </w:rPr>
-      </w:pPr>
-      <w:r>
-        <w:rPr>
-          <w:rFonts w:hint="default"/>
+          <w:lang w:val="en-US" w:eastAsia="zh-CN"/>
+        </w:rPr>
+      </w:pPr>
+      <w:r>
+        <w:rPr>
+          <w:rFonts w:hint="eastAsia" w:eastAsia="SimSun"/>
           <w:b/>
           <w:bCs/>
-        </w:rPr>
-        <w:t xml:space="preserve">Machine Learning &amp; Statistics: </w:t>
-      </w:r>
-      <w:r>
-        <w:rPr>
-          <w:rFonts w:hint="default"/>
+          <w:lang w:val="en-US" w:eastAsia="zh-CN"/>
+        </w:rPr>
+        <w:t>Deep Learning:</w:t>
+      </w:r>
+      <w:r>
+        <w:rPr>
+          <w:rFonts w:hint="eastAsia" w:eastAsia="SimSun"/>
           <w:b w:val="0"/>
           <w:bCs w:val="0"/>
-        </w:rPr>
-        <w:t>XGBoost,</w:t>
-      </w:r>
-      <w:r>
+          <w:lang w:val="en-US" w:eastAsia="zh-CN"/>
+        </w:rPr>
+        <w:t xml:space="preserve"> PyTorch, TensorFlow, Hugging Face, CNNs, LSTMs, Reinforcement Learning (PPO)</w:t>
+      </w:r>
+    </w:p>
+    <w:p>
+      <w:pPr>
+        <w:pStyle w:val="29"/>
         <w:rPr>
           <w:rFonts w:hint="eastAsia" w:eastAsia="SimSun"/>
           <w:b w:val="0"/>
           <w:bCs w:val="0"/>
           <w:lang w:val="en-US" w:eastAsia="zh-CN"/>
         </w:rPr>
-        <w:t xml:space="preserve"> </w:t>
-      </w:r>
-      <w:r>
-        <w:rPr>
-          <w:rFonts w:hint="default"/>
+      </w:pPr>
+      <w:r>
+        <w:rPr>
+          <w:rFonts w:hint="eastAsia" w:eastAsia="SimSun"/>
+          <w:b/>
+          <w:bCs/>
+          <w:lang w:val="en-US" w:eastAsia="zh-CN"/>
+        </w:rPr>
+        <w:t xml:space="preserve">Statistics: </w:t>
+      </w:r>
+      <w:r>
+        <w:rPr>
+          <w:rFonts w:hint="eastAsia" w:eastAsia="SimSun"/>
           <w:b w:val="0"/>
           <w:bCs w:val="0"/>
-        </w:rPr>
-        <w:t xml:space="preserve">Random Forest, Prophet, ARIMA, GLM/Regression, scikit-learn, GridSearchCV, cross-validation, feature engineering, time series analysis, statistical testing, </w:t>
-      </w:r>
-      <w:r>
-        <w:rPr>
-          <w:rFonts w:hint="eastAsia" w:eastAsia="SimSun"/>
+          <w:lang w:val="en-US" w:eastAsia="zh-CN"/>
+        </w:rPr>
+        <w:t>A/B testing, experimental design, hypothesis testing, regression</w:t>
+      </w:r>
+    </w:p>
+    <w:p>
+      <w:pPr>
+        <w:pStyle w:val="29"/>
+        <w:rPr>
+          <w:rFonts w:hint="default" w:eastAsia="SimSun"/>
           <w:b w:val="0"/>
           <w:bCs w:val="0"/>
           <w:lang w:val="en-US" w:eastAsia="zh-CN"/>
         </w:rPr>
-        <w:t xml:space="preserve">A/B testing, Experimental design, </w:t>
-      </w:r>
-      <w:r>
-        <w:rPr>
-          <w:rFonts w:hint="default"/>
-          <w:b w:val="0"/>
-          <w:bCs w:val="0"/>
-        </w:rPr>
-        <w:t>LLM application development (RAG, grounding, prompt/agent design, tool use, evaluation), GraphRAG, multi-agent simulation</w:t>
-      </w:r>
-    </w:p>
-    <w:p>
-      <w:pPr>
-        <w:pStyle w:val="29"/>
+      </w:pPr>
+      <w:r>
         <w:rPr>
           <w:rFonts w:hint="default" w:eastAsia="SimSun"/>
           <w:b/>
           <w:bCs/>
           <w:lang w:val="en-US" w:eastAsia="zh-CN"/>
         </w:rPr>
-      </w:pPr>
-      <w:r>
-        <w:rPr>
-          <w:rFonts w:hint="default"/>
+        <w:t>Platforms:</w:t>
+      </w:r>
+      <w:r>
+        <w:rPr>
+          <w:rFonts w:hint="default" w:eastAsia="SimSun"/>
+          <w:b w:val="0"/>
+          <w:bCs w:val="0"/>
+          <w:lang w:val="en-US" w:eastAsia="zh-CN"/>
+        </w:rPr>
+        <w:t xml:space="preserve"> AWS (Lambda, S3, Bedrock, QuickSight, AppFlow, EventBridge, OpenSearch, API Gateway, CDK), Snowflake, Vercel, Streamlit, Git, GitHub Actions</w:t>
+      </w:r>
+    </w:p>
+    <w:p>
+      <w:pPr>
+        <w:pStyle w:val="29"/>
+        <w:rPr>
+          <w:rFonts w:hint="default" w:eastAsia="SimSun"/>
+          <w:b w:val="0"/>
+          <w:bCs w:val="0"/>
+          <w:lang w:val="en-US" w:eastAsia="zh-CN"/>
+        </w:rPr>
+      </w:pPr>
+      <w:r>
+        <w:rPr>
+          <w:rFonts w:hint="default" w:eastAsia="SimSun"/>
           <w:b/>
           <w:bCs/>
-        </w:rPr>
-        <w:t xml:space="preserve">Data &amp; Cloud: </w:t>
-      </w:r>
-      <w:r>
-        <w:rPr>
-          <w:rFonts w:hint="default"/>
+          <w:lang w:val="en-US" w:eastAsia="zh-CN"/>
+        </w:rPr>
+        <w:t>AI/LLMs:</w:t>
+      </w:r>
+      <w:r>
+        <w:rPr>
+          <w:rFonts w:hint="default" w:eastAsia="SimSun"/>
           <w:b w:val="0"/>
           <w:bCs w:val="0"/>
-        </w:rPr>
-        <w:t>Snowflake, AWS (Lambda, S3, AppFlow, QuickSight, EventBridge, Bedrock, OpenSearch Serverless, API Gateway, CDK), pandas, NumPy, Excel, Git, REST APIs, JSON</w:t>
-      </w:r>
-      <w:r>
-        <w:rPr>
-          <w:rFonts w:hint="eastAsia" w:eastAsia="SimSun"/>
-          <w:b w:val="0"/>
-          <w:bCs w:val="0"/>
-          <w:lang w:val="en-US" w:eastAsia="zh-CN"/>
-        </w:rPr>
-        <w:t>, CI/CD (Github Action), Streamlit, pdfplumber, yfinance</w:t>
-      </w:r>
-    </w:p>
-    <w:p>
-      <w:pPr>
-        <w:pStyle w:val="29"/>
-      </w:pPr>
-      <w:r>
-        <w:rPr>
-          <w:b/>
-        </w:rPr>
-        <w:t xml:space="preserve">AI &amp; Agents: </w:t>
-      </w:r>
-      <w:r>
-        <w:rPr>
-          <w:b w:val="0"/>
-        </w:rPr>
-        <w:t>Multi-agent simulation (OASIS, CAMEL-AI), GraphRAG (Zep), OpenAI-compatible LLM APIs (Qwen, Claude), MiroFish geopolitical simulation engine</w:t>
-      </w:r>
-    </w:p>
-    <w:p>
-      <w:pPr>
-        <w:pStyle w:val="29"/>
-        <w:rPr>
-          <w:rFonts w:hint="default"/>
-          <w:b/>
-          <w:bCs/>
-        </w:rPr>
-      </w:pPr>
-      <w:r>
-        <w:rPr>
-          <w:rFonts w:hint="default"/>
-          <w:b/>
-          <w:bCs/>
-        </w:rPr>
-        <w:t xml:space="preserve">ETL &amp; Data Engineering: </w:t>
-      </w:r>
-      <w:r>
-        <w:rPr>
-          <w:rFonts w:hint="default"/>
-          <w:b w:val="0"/>
-          <w:bCs w:val="0"/>
-        </w:rPr>
-        <w:t>ETL/ELT pipelines, data quality monitoring, dimensional modeling, data warehousing</w:t>
-      </w:r>
-    </w:p>
-    <w:p>
-      <w:pPr>
-        <w:pStyle w:val="29"/>
-        <w:rPr>
-          <w:rFonts w:hint="default"/>
-          <w:b w:val="0"/>
-          <w:bCs w:val="0"/>
-        </w:rPr>
-      </w:pPr>
-      <w:r>
-        <w:rPr>
-          <w:rFonts w:hint="default"/>
-          <w:b/>
-          <w:bCs/>
-        </w:rPr>
-        <w:t xml:space="preserve">Visualization &amp; BI: </w:t>
-      </w:r>
-      <w:r>
-        <w:rPr>
-          <w:rFonts w:hint="default"/>
-          <w:b w:val="0"/>
-          <w:bCs w:val="0"/>
-        </w:rPr>
-        <w:t>matplotlib, seaborn, Plotly, Plotly Dash, QuickSight, Power BI, Tableau, Streamlit, interactive dashboards</w:t>
+          <w:lang w:val="en-US" w:eastAsia="zh-CN"/>
+        </w:rPr>
+        <w:t xml:space="preserve"> Multi-agent simulation (OASIS, CAMEL-AI), GraphRAG (Zep), LLM application development (RAG, prompt engineering, tool use, agent design), OpenAI-compatible APIs</w:t>
       </w:r>
     </w:p>
     <w:sectPr>

</xml_diff>